<commit_message>
Regenerate analysis, summary, report and patent with GuardCode-ML
Co-Authored-By: Claude Opus 5.5 <noreply@anthropic.com>
Claude-Session: https://claude.ai/code/session_01Jz5mTV9VNp6ybzdPShsnCo
</commit_message>
<xml_diff>
--- a/docs/GuardCode_Project_Report.docx
+++ b/docs/GuardCode_Project_Report.docx
@@ -530,7 +530,7 @@
       </w:tr>
       <w:tr>
         <w:trPr>
-          <w:tblHeader w:val="false"/>
+          <w:tblHeader w:val="off"/>
         </w:trPr>
         <w:tc>
           <w:tcPr>
@@ -599,7 +599,7 @@
       </w:tr>
       <w:tr>
         <w:trPr>
-          <w:tblHeader w:val="false"/>
+          <w:tblHeader w:val="off"/>
         </w:trPr>
         <w:tc>
           <w:tcPr>
@@ -668,7 +668,7 @@
       </w:tr>
       <w:tr>
         <w:trPr>
-          <w:tblHeader w:val="false"/>
+          <w:tblHeader w:val="off"/>
         </w:trPr>
         <w:tc>
           <w:tcPr>
@@ -737,7 +737,7 @@
       </w:tr>
       <w:tr>
         <w:trPr>
-          <w:tblHeader w:val="false"/>
+          <w:tblHeader w:val="off"/>
         </w:trPr>
         <w:tc>
           <w:tcPr>
@@ -806,7 +806,7 @@
       </w:tr>
       <w:tr>
         <w:trPr>
-          <w:tblHeader w:val="false"/>
+          <w:tblHeader w:val="off"/>
         </w:trPr>
         <w:tc>
           <w:tcPr>
@@ -875,7 +875,7 @@
       </w:tr>
       <w:tr>
         <w:trPr>
-          <w:tblHeader w:val="false"/>
+          <w:tblHeader w:val="off"/>
         </w:trPr>
         <w:tc>
           <w:tcPr>
@@ -944,7 +944,7 @@
       </w:tr>
       <w:tr>
         <w:trPr>
-          <w:tblHeader w:val="false"/>
+          <w:tblHeader w:val="off"/>
         </w:trPr>
         <w:tc>
           <w:tcPr>
@@ -1140,7 +1140,7 @@
       </w:tr>
       <w:tr>
         <w:trPr>
-          <w:tblHeader w:val="false"/>
+          <w:tblHeader w:val="off"/>
         </w:trPr>
         <w:tc>
           <w:tcPr>
@@ -1241,7 +1241,7 @@
       </w:tr>
       <w:tr>
         <w:trPr>
-          <w:tblHeader w:val="false"/>
+          <w:tblHeader w:val="off"/>
         </w:trPr>
         <w:tc>
           <w:tcPr>
@@ -1342,7 +1342,7 @@
       </w:tr>
       <w:tr>
         <w:trPr>
-          <w:tblHeader w:val="false"/>
+          <w:tblHeader w:val="off"/>
         </w:trPr>
         <w:tc>
           <w:tcPr>
@@ -1443,7 +1443,7 @@
       </w:tr>
       <w:tr>
         <w:trPr>
-          <w:tblHeader w:val="false"/>
+          <w:tblHeader w:val="off"/>
         </w:trPr>
         <w:tc>
           <w:tcPr>
@@ -1544,7 +1544,7 @@
       </w:tr>
       <w:tr>
         <w:trPr>
-          <w:tblHeader w:val="false"/>
+          <w:tblHeader w:val="off"/>
         </w:trPr>
         <w:tc>
           <w:tcPr>
@@ -1686,7 +1686,7 @@
           <wp:inline distT="0" distB="0" distL="0" distR="0">
             <wp:extent cx="5715000" cy="2457450"/>
             <wp:effectExtent t="0" r="0" b="0" l="0"/>
-            <wp:docPr id="1" name="" descr="" title=""/>
+            <wp:docPr id="1" name=""/>
             <wp:cNvGraphicFramePr>
               <a:graphicFrameLocks xmlns:a="http://schemas.openxmlformats.org/drawingml/2006/main" noChangeAspect="1"/>
             </wp:cNvGraphicFramePr>
@@ -2004,6 +2004,23 @@
     </w:p>
     <w:p>
       <w:pPr>
+        <w:pStyle w:val="Heading2"/>
+      </w:pPr>
+      <w:r>
+        <w:t xml:space="preserve">3.6 Learned risk classifier (GuardCode-ML)</w:t>
+      </w:r>
+    </w:p>
+    <w:p>
+      <w:pPr>
+        <w:spacing w:after="120" w:line="300"/>
+        <w:jc w:val="both"/>
+      </w:pPr>
+      <w:r>
+        <w:t xml:space="preserve">The Soft-Syndrome Guard is an exact posterior only when the decoder's posteriors are calibrated, and a neural decoder is only approximately calibrated. GuardCode-ML therefore adds a second, learned opinion. A gradient-boosted decision-tree classifier (scikit-learn HistGradientBoostingClassifier, open source) is trained on CRC-passing frames to predict whether the frame is nevertheless wrong. Its inputs are all available at the receiver: the SSG risk, the smallest |LLR|, the per-byte posterior confidence and runner-up gap, the residual energy after re-encoding the decoded bits, and the burst index. It needs no extra bits and leaves the CRC polynomial unchanged. Its acceptance threshold is calibrated to the same retransmission budget as the other gates (1 % of correct frames rejected at 3 dB). Training and benchmark random seeds are disjoint.</w:t>
+      </w:r>
+    </w:p>
+    <w:p>
+      <w:pPr>
         <w:pStyle w:val="Heading1"/>
       </w:pPr>
       <w:r>
@@ -2130,7 +2147,7 @@
       </w:tr>
       <w:tr>
         <w:trPr>
-          <w:tblHeader w:val="false"/>
+          <w:tblHeader w:val="off"/>
         </w:trPr>
         <w:tc>
           <w:tcPr>
@@ -2231,7 +2248,7 @@
       </w:tr>
       <w:tr>
         <w:trPr>
-          <w:tblHeader w:val="false"/>
+          <w:tblHeader w:val="off"/>
         </w:trPr>
         <w:tc>
           <w:tcPr>
@@ -2332,7 +2349,7 @@
       </w:tr>
       <w:tr>
         <w:trPr>
-          <w:tblHeader w:val="false"/>
+          <w:tblHeader w:val="off"/>
         </w:trPr>
         <w:tc>
           <w:tcPr>
@@ -2433,7 +2450,7 @@
       </w:tr>
       <w:tr>
         <w:trPr>
-          <w:tblHeader w:val="false"/>
+          <w:tblHeader w:val="off"/>
         </w:trPr>
         <w:tc>
           <w:tcPr>
@@ -2534,7 +2551,7 @@
       </w:tr>
       <w:tr>
         <w:trPr>
-          <w:tblHeader w:val="false"/>
+          <w:tblHeader w:val="off"/>
         </w:trPr>
         <w:tc>
           <w:tcPr>
@@ -2635,7 +2652,7 @@
       </w:tr>
       <w:tr>
         <w:trPr>
-          <w:tblHeader w:val="false"/>
+          <w:tblHeader w:val="off"/>
         </w:trPr>
         <w:tc>
           <w:tcPr>
@@ -2736,7 +2753,7 @@
       </w:tr>
       <w:tr>
         <w:trPr>
-          <w:tblHeader w:val="false"/>
+          <w:tblHeader w:val="off"/>
         </w:trPr>
         <w:tc>
           <w:tcPr>
@@ -2837,7 +2854,7 @@
       </w:tr>
       <w:tr>
         <w:trPr>
-          <w:tblHeader w:val="false"/>
+          <w:tblHeader w:val="off"/>
         </w:trPr>
         <w:tc>
           <w:tcPr>
@@ -2938,7 +2955,7 @@
       </w:tr>
       <w:tr>
         <w:trPr>
-          <w:tblHeader w:val="false"/>
+          <w:tblHeader w:val="off"/>
         </w:trPr>
         <w:tc>
           <w:tcPr>
@@ -3039,7 +3056,7 @@
       </w:tr>
       <w:tr>
         <w:trPr>
-          <w:tblHeader w:val="false"/>
+          <w:tblHeader w:val="off"/>
         </w:trPr>
         <w:tc>
           <w:tcPr>
@@ -3291,7 +3308,7 @@
       </w:tr>
       <w:tr>
         <w:trPr>
-          <w:tblHeader w:val="false"/>
+          <w:tblHeader w:val="off"/>
         </w:trPr>
         <w:tc>
           <w:tcPr>
@@ -3392,7 +3409,7 @@
       </w:tr>
       <w:tr>
         <w:trPr>
-          <w:tblHeader w:val="false"/>
+          <w:tblHeader w:val="off"/>
         </w:trPr>
         <w:tc>
           <w:tcPr>
@@ -3493,7 +3510,7 @@
       </w:tr>
       <w:tr>
         <w:trPr>
-          <w:tblHeader w:val="false"/>
+          <w:tblHeader w:val="off"/>
         </w:trPr>
         <w:tc>
           <w:tcPr>
@@ -3594,7 +3611,7 @@
       </w:tr>
       <w:tr>
         <w:trPr>
-          <w:tblHeader w:val="false"/>
+          <w:tblHeader w:val="off"/>
         </w:trPr>
         <w:tc>
           <w:tcPr>
@@ -3695,7 +3712,7 @@
       </w:tr>
       <w:tr>
         <w:trPr>
-          <w:tblHeader w:val="false"/>
+          <w:tblHeader w:val="off"/>
         </w:trPr>
         <w:tc>
           <w:tcPr>
@@ -3987,7 +4004,7 @@
       </w:tr>
       <w:tr>
         <w:trPr>
-          <w:tblHeader w:val="false"/>
+          <w:tblHeader w:val="off"/>
         </w:trPr>
         <w:tc>
           <w:tcPr>
@@ -4056,7 +4073,7 @@
       </w:tr>
       <w:tr>
         <w:trPr>
-          <w:tblHeader w:val="false"/>
+          <w:tblHeader w:val="off"/>
         </w:trPr>
         <w:tc>
           <w:tcPr>
@@ -4125,7 +4142,7 @@
       </w:tr>
       <w:tr>
         <w:trPr>
-          <w:tblHeader w:val="false"/>
+          <w:tblHeader w:val="off"/>
         </w:trPr>
         <w:tc>
           <w:tcPr>
@@ -4194,7 +4211,7 @@
       </w:tr>
       <w:tr>
         <w:trPr>
-          <w:tblHeader w:val="false"/>
+          <w:tblHeader w:val="off"/>
         </w:trPr>
         <w:tc>
           <w:tcPr>
@@ -4263,7 +4280,7 @@
       </w:tr>
       <w:tr>
         <w:trPr>
-          <w:tblHeader w:val="false"/>
+          <w:tblHeader w:val="off"/>
         </w:trPr>
         <w:tc>
           <w:tcPr>
@@ -4332,7 +4349,7 @@
       </w:tr>
       <w:tr>
         <w:trPr>
-          <w:tblHeader w:val="false"/>
+          <w:tblHeader w:val="off"/>
         </w:trPr>
         <w:tc>
           <w:tcPr>
@@ -4401,7 +4418,7 @@
       </w:tr>
       <w:tr>
         <w:trPr>
-          <w:tblHeader w:val="false"/>
+          <w:tblHeader w:val="off"/>
         </w:trPr>
         <w:tc>
           <w:tcPr>
@@ -4470,7 +4487,7 @@
       </w:tr>
       <w:tr>
         <w:trPr>
-          <w:tblHeader w:val="false"/>
+          <w:tblHeader w:val="off"/>
         </w:trPr>
         <w:tc>
           <w:tcPr>
@@ -4579,7 +4596,7 @@
           <wp:inline distT="0" distB="0" distL="0" distR="0">
             <wp:extent cx="5334000" cy="3895725"/>
             <wp:effectExtent t="0" r="0" b="0" l="0"/>
-            <wp:docPr id="1" name="" descr="" title=""/>
+            <wp:docPr id="2" name=""/>
             <wp:cNvGraphicFramePr>
               <a:graphicFrameLocks xmlns:a="http://schemas.openxmlformats.org/drawingml/2006/main" noChangeAspect="1"/>
             </wp:cNvGraphicFramePr>
@@ -4957,7 +4974,7 @@
       </w:tr>
       <w:tr>
         <w:trPr>
-          <w:tblHeader w:val="false"/>
+          <w:tblHeader w:val="off"/>
         </w:trPr>
         <w:tc>
           <w:tcPr>
@@ -5250,7 +5267,7 @@
       </w:tr>
       <w:tr>
         <w:trPr>
-          <w:tblHeader w:val="false"/>
+          <w:tblHeader w:val="off"/>
         </w:trPr>
         <w:tc>
           <w:tcPr>
@@ -5543,7 +5560,7 @@
       </w:tr>
       <w:tr>
         <w:trPr>
-          <w:tblHeader w:val="false"/>
+          <w:tblHeader w:val="off"/>
         </w:trPr>
         <w:tc>
           <w:tcPr>
@@ -5836,7 +5853,7 @@
       </w:tr>
       <w:tr>
         <w:trPr>
-          <w:tblHeader w:val="false"/>
+          <w:tblHeader w:val="off"/>
         </w:trPr>
         <w:tc>
           <w:tcPr>
@@ -6129,7 +6146,7 @@
       </w:tr>
       <w:tr>
         <w:trPr>
-          <w:tblHeader w:val="false"/>
+          <w:tblHeader w:val="off"/>
         </w:trPr>
         <w:tc>
           <w:tcPr>
@@ -6422,7 +6439,7 @@
       </w:tr>
       <w:tr>
         <w:trPr>
-          <w:tblHeader w:val="false"/>
+          <w:tblHeader w:val="off"/>
         </w:trPr>
         <w:tc>
           <w:tcPr>
@@ -6453,6 +6470,299 @@
                 <w:szCs w:val="20"/>
               </w:rPr>
               <w:t xml:space="preserve">GuardCode</w:t>
+            </w:r>
+          </w:p>
+        </w:tc>
+        <w:tc>
+          <w:tcPr>
+            <w:tcW w:type="dxa" w:w="846"/>
+            <w:tcBorders>
+              <w:top w:val="single" w:color="000000" w:sz="4"/>
+              <w:left w:val="single" w:color="000000" w:sz="4"/>
+              <w:bottom w:val="single" w:color="000000" w:sz="4"/>
+              <w:right w:val="single" w:color="000000" w:sz="4"/>
+            </w:tcBorders>
+            <w:tcMar>
+              <w:top w:type="dxa" w:w="60"/>
+              <w:left w:type="dxa" w:w="100"/>
+              <w:bottom w:type="dxa" w:w="60"/>
+              <w:right w:type="dxa" w:w="100"/>
+            </w:tcMar>
+          </w:tcPr>
+          <w:p>
+            <w:pPr>
+              <w:jc w:val="center"/>
+            </w:pPr>
+            <w:r>
+              <w:rPr>
+                <w:rFonts w:ascii="Times New Roman" w:cs="Times New Roman" w:eastAsia="Times New Roman" w:hAnsi="Times New Roman"/>
+                <w:b w:val="false"/>
+                <w:bCs w:val="false"/>
+                <w:sz w:val="20"/>
+                <w:szCs w:val="20"/>
+              </w:rPr>
+              <w:t xml:space="preserve">0.9182</w:t>
+            </w:r>
+          </w:p>
+        </w:tc>
+        <w:tc>
+          <w:tcPr>
+            <w:tcW w:type="dxa" w:w="846"/>
+            <w:tcBorders>
+              <w:top w:val="single" w:color="000000" w:sz="4"/>
+              <w:left w:val="single" w:color="000000" w:sz="4"/>
+              <w:bottom w:val="single" w:color="000000" w:sz="4"/>
+              <w:right w:val="single" w:color="000000" w:sz="4"/>
+            </w:tcBorders>
+            <w:tcMar>
+              <w:top w:type="dxa" w:w="60"/>
+              <w:left w:type="dxa" w:w="100"/>
+              <w:bottom w:type="dxa" w:w="60"/>
+              <w:right w:type="dxa" w:w="100"/>
+            </w:tcMar>
+          </w:tcPr>
+          <w:p>
+            <w:pPr>
+              <w:jc w:val="center"/>
+            </w:pPr>
+            <w:r>
+              <w:rPr>
+                <w:rFonts w:ascii="Times New Roman" w:cs="Times New Roman" w:eastAsia="Times New Roman" w:hAnsi="Times New Roman"/>
+                <w:b w:val="false"/>
+                <w:bCs w:val="false"/>
+                <w:sz w:val="20"/>
+                <w:szCs w:val="20"/>
+              </w:rPr>
+              <w:t xml:space="preserve">0.7969</w:t>
+            </w:r>
+          </w:p>
+        </w:tc>
+        <w:tc>
+          <w:tcPr>
+            <w:tcW w:type="dxa" w:w="846"/>
+            <w:tcBorders>
+              <w:top w:val="single" w:color="000000" w:sz="4"/>
+              <w:left w:val="single" w:color="000000" w:sz="4"/>
+              <w:bottom w:val="single" w:color="000000" w:sz="4"/>
+              <w:right w:val="single" w:color="000000" w:sz="4"/>
+            </w:tcBorders>
+            <w:tcMar>
+              <w:top w:type="dxa" w:w="60"/>
+              <w:left w:type="dxa" w:w="100"/>
+              <w:bottom w:type="dxa" w:w="60"/>
+              <w:right w:type="dxa" w:w="100"/>
+            </w:tcMar>
+          </w:tcPr>
+          <w:p>
+            <w:pPr>
+              <w:jc w:val="center"/>
+            </w:pPr>
+            <w:r>
+              <w:rPr>
+                <w:rFonts w:ascii="Times New Roman" w:cs="Times New Roman" w:eastAsia="Times New Roman" w:hAnsi="Times New Roman"/>
+                <w:b w:val="false"/>
+                <w:bCs w:val="false"/>
+                <w:sz w:val="20"/>
+                <w:szCs w:val="20"/>
+              </w:rPr>
+              <w:t xml:space="preserve">0.5922</w:t>
+            </w:r>
+          </w:p>
+        </w:tc>
+        <w:tc>
+          <w:tcPr>
+            <w:tcW w:type="dxa" w:w="846"/>
+            <w:tcBorders>
+              <w:top w:val="single" w:color="000000" w:sz="4"/>
+              <w:left w:val="single" w:color="000000" w:sz="4"/>
+              <w:bottom w:val="single" w:color="000000" w:sz="4"/>
+              <w:right w:val="single" w:color="000000" w:sz="4"/>
+            </w:tcBorders>
+            <w:tcMar>
+              <w:top w:type="dxa" w:w="60"/>
+              <w:left w:type="dxa" w:w="100"/>
+              <w:bottom w:type="dxa" w:w="60"/>
+              <w:right w:type="dxa" w:w="100"/>
+            </w:tcMar>
+          </w:tcPr>
+          <w:p>
+            <w:pPr>
+              <w:jc w:val="center"/>
+            </w:pPr>
+            <w:r>
+              <w:rPr>
+                <w:rFonts w:ascii="Times New Roman" w:cs="Times New Roman" w:eastAsia="Times New Roman" w:hAnsi="Times New Roman"/>
+                <w:b w:val="false"/>
+                <w:bCs w:val="false"/>
+                <w:sz w:val="20"/>
+                <w:szCs w:val="20"/>
+              </w:rPr>
+              <w:t xml:space="preserve">0.3523</w:t>
+            </w:r>
+          </w:p>
+        </w:tc>
+        <w:tc>
+          <w:tcPr>
+            <w:tcW w:type="dxa" w:w="846"/>
+            <w:tcBorders>
+              <w:top w:val="single" w:color="000000" w:sz="4"/>
+              <w:left w:val="single" w:color="000000" w:sz="4"/>
+              <w:bottom w:val="single" w:color="000000" w:sz="4"/>
+              <w:right w:val="single" w:color="000000" w:sz="4"/>
+            </w:tcBorders>
+            <w:tcMar>
+              <w:top w:type="dxa" w:w="60"/>
+              <w:left w:type="dxa" w:w="100"/>
+              <w:bottom w:type="dxa" w:w="60"/>
+              <w:right w:type="dxa" w:w="100"/>
+            </w:tcMar>
+          </w:tcPr>
+          <w:p>
+            <w:pPr>
+              <w:jc w:val="center"/>
+            </w:pPr>
+            <w:r>
+              <w:rPr>
+                <w:rFonts w:ascii="Times New Roman" w:cs="Times New Roman" w:eastAsia="Times New Roman" w:hAnsi="Times New Roman"/>
+                <w:b w:val="false"/>
+                <w:bCs w:val="false"/>
+                <w:sz w:val="20"/>
+                <w:szCs w:val="20"/>
+              </w:rPr>
+              <w:t xml:space="preserve">0.1574</w:t>
+            </w:r>
+          </w:p>
+        </w:tc>
+        <w:tc>
+          <w:tcPr>
+            <w:tcW w:type="dxa" w:w="846"/>
+            <w:tcBorders>
+              <w:top w:val="single" w:color="000000" w:sz="4"/>
+              <w:left w:val="single" w:color="000000" w:sz="4"/>
+              <w:bottom w:val="single" w:color="000000" w:sz="4"/>
+              <w:right w:val="single" w:color="000000" w:sz="4"/>
+            </w:tcBorders>
+            <w:tcMar>
+              <w:top w:type="dxa" w:w="60"/>
+              <w:left w:type="dxa" w:w="100"/>
+              <w:bottom w:type="dxa" w:w="60"/>
+              <w:right w:type="dxa" w:w="100"/>
+            </w:tcMar>
+          </w:tcPr>
+          <w:p>
+            <w:pPr>
+              <w:jc w:val="center"/>
+            </w:pPr>
+            <w:r>
+              <w:rPr>
+                <w:rFonts w:ascii="Times New Roman" w:cs="Times New Roman" w:eastAsia="Times New Roman" w:hAnsi="Times New Roman"/>
+                <w:b w:val="false"/>
+                <w:bCs w:val="false"/>
+                <w:sz w:val="20"/>
+                <w:szCs w:val="20"/>
+              </w:rPr>
+              <w:t xml:space="preserve">0.0517</w:t>
+            </w:r>
+          </w:p>
+        </w:tc>
+        <w:tc>
+          <w:tcPr>
+            <w:tcW w:type="dxa" w:w="846"/>
+            <w:tcBorders>
+              <w:top w:val="single" w:color="000000" w:sz="4"/>
+              <w:left w:val="single" w:color="000000" w:sz="4"/>
+              <w:bottom w:val="single" w:color="000000" w:sz="4"/>
+              <w:right w:val="single" w:color="000000" w:sz="4"/>
+            </w:tcBorders>
+            <w:tcMar>
+              <w:top w:type="dxa" w:w="60"/>
+              <w:left w:type="dxa" w:w="100"/>
+              <w:bottom w:type="dxa" w:w="60"/>
+              <w:right w:type="dxa" w:w="100"/>
+            </w:tcMar>
+          </w:tcPr>
+          <w:p>
+            <w:pPr>
+              <w:jc w:val="center"/>
+            </w:pPr>
+            <w:r>
+              <w:rPr>
+                <w:rFonts w:ascii="Times New Roman" w:cs="Times New Roman" w:eastAsia="Times New Roman" w:hAnsi="Times New Roman"/>
+                <w:b w:val="false"/>
+                <w:bCs w:val="false"/>
+                <w:sz w:val="20"/>
+                <w:szCs w:val="20"/>
+              </w:rPr>
+              <w:t xml:space="preserve">0.0120</w:t>
+            </w:r>
+          </w:p>
+        </w:tc>
+        <w:tc>
+          <w:tcPr>
+            <w:tcW w:type="dxa" w:w="846"/>
+            <w:tcBorders>
+              <w:top w:val="single" w:color="000000" w:sz="4"/>
+              <w:left w:val="single" w:color="000000" w:sz="4"/>
+              <w:bottom w:val="single" w:color="000000" w:sz="4"/>
+              <w:right w:val="single" w:color="000000" w:sz="4"/>
+            </w:tcBorders>
+            <w:tcMar>
+              <w:top w:type="dxa" w:w="60"/>
+              <w:left w:type="dxa" w:w="100"/>
+              <w:bottom w:type="dxa" w:w="60"/>
+              <w:right w:type="dxa" w:w="100"/>
+            </w:tcMar>
+          </w:tcPr>
+          <w:p>
+            <w:pPr>
+              <w:jc w:val="center"/>
+            </w:pPr>
+            <w:r>
+              <w:rPr>
+                <w:rFonts w:ascii="Times New Roman" w:cs="Times New Roman" w:eastAsia="Times New Roman" w:hAnsi="Times New Roman"/>
+                <w:b w:val="false"/>
+                <w:bCs w:val="false"/>
+                <w:sz w:val="20"/>
+                <w:szCs w:val="20"/>
+              </w:rPr>
+              <w:t xml:space="preserve">0.0021</w:t>
+            </w:r>
+          </w:p>
+        </w:tc>
+      </w:tr>
+      <w:tr>
+        <w:trPr>
+          <w:tblHeader w:val="off"/>
+        </w:trPr>
+        <w:tc>
+          <w:tcPr>
+            <w:tcW w:type="dxa" w:w="2538"/>
+            <w:tcBorders>
+              <w:top w:val="single" w:color="000000" w:sz="4"/>
+              <w:left w:val="single" w:color="000000" w:sz="4"/>
+              <w:bottom w:val="single" w:color="000000" w:sz="4"/>
+              <w:right w:val="single" w:color="000000" w:sz="4"/>
+            </w:tcBorders>
+            <w:tcMar>
+              <w:top w:type="dxa" w:w="60"/>
+              <w:left w:type="dxa" w:w="100"/>
+              <w:bottom w:type="dxa" w:w="60"/>
+              <w:right w:type="dxa" w:w="100"/>
+            </w:tcMar>
+          </w:tcPr>
+          <w:p>
+            <w:pPr>
+              <w:jc w:val="left"/>
+            </w:pPr>
+            <w:r>
+              <w:rPr>
+                <w:rFonts w:ascii="Times New Roman" w:cs="Times New Roman" w:eastAsia="Times New Roman" w:hAnsi="Times New Roman"/>
+                <w:b w:val="false"/>
+                <w:bCs w:val="false"/>
+                <w:sz w:val="20"/>
+                <w:szCs w:val="20"/>
+              </w:rPr>
+              <w:t xml:space="preserve">GuardCode-ML</w:t>
             </w:r>
           </w:p>
         </w:tc>
@@ -6739,7 +7049,7 @@
           <wp:inline distT="0" distB="0" distL="0" distR="0">
             <wp:extent cx="5334000" cy="3895725"/>
             <wp:effectExtent t="0" r="0" b="0" l="0"/>
-            <wp:docPr id="1" name="" descr="" title=""/>
+            <wp:docPr id="3" name=""/>
             <wp:cNvGraphicFramePr>
               <a:graphicFrameLocks xmlns:a="http://schemas.openxmlformats.org/drawingml/2006/main" noChangeAspect="1"/>
             </wp:cNvGraphicFramePr>
@@ -7017,7 +7327,7 @@
       </w:tr>
       <w:tr>
         <w:trPr>
-          <w:tblHeader w:val="false"/>
+          <w:tblHeader w:val="off"/>
         </w:trPr>
         <w:tc>
           <w:tcPr>
@@ -7214,7 +7524,7 @@
       </w:tr>
       <w:tr>
         <w:trPr>
-          <w:tblHeader w:val="false"/>
+          <w:tblHeader w:val="off"/>
         </w:trPr>
         <w:tc>
           <w:tcPr>
@@ -7411,7 +7721,7 @@
       </w:tr>
       <w:tr>
         <w:trPr>
-          <w:tblHeader w:val="false"/>
+          <w:tblHeader w:val="off"/>
         </w:trPr>
         <w:tc>
           <w:tcPr>
@@ -7608,7 +7918,7 @@
       </w:tr>
       <w:tr>
         <w:trPr>
-          <w:tblHeader w:val="false"/>
+          <w:tblHeader w:val="off"/>
         </w:trPr>
         <w:tc>
           <w:tcPr>
@@ -7702,7 +8012,7 @@
                 <w:sz w:val="20"/>
                 <w:szCs w:val="20"/>
               </w:rPr>
-              <w:t xml:space="preserve">8,64,837</w:t>
+              <w:t xml:space="preserve">8,64,836</w:t>
             </w:r>
           </w:p>
         </w:tc>
@@ -7805,7 +8115,7 @@
       </w:tr>
       <w:tr>
         <w:trPr>
-          <w:tblHeader w:val="false"/>
+          <w:tblHeader w:val="off"/>
         </w:trPr>
         <w:tc>
           <w:tcPr>
@@ -7899,7 +8209,7 @@
                 <w:sz w:val="20"/>
                 <w:szCs w:val="20"/>
               </w:rPr>
-              <w:t xml:space="preserve">8,64,837</w:t>
+              <w:t xml:space="preserve">8,64,836</w:t>
             </w:r>
           </w:p>
         </w:tc>
@@ -8002,7 +8312,7 @@
       </w:tr>
       <w:tr>
         <w:trPr>
-          <w:tblHeader w:val="false"/>
+          <w:tblHeader w:val="off"/>
         </w:trPr>
         <w:tc>
           <w:tcPr>
@@ -8096,7 +8406,7 @@
                 <w:sz w:val="20"/>
                 <w:szCs w:val="20"/>
               </w:rPr>
-              <w:t xml:space="preserve">8,64,837</w:t>
+              <w:t xml:space="preserve">8,64,836</w:t>
             </w:r>
           </w:p>
         </w:tc>
@@ -8193,6 +8503,203 @@
                 <w:szCs w:val="20"/>
               </w:rPr>
               <w:t xml:space="preserve">132</w:t>
+            </w:r>
+          </w:p>
+        </w:tc>
+      </w:tr>
+      <w:tr>
+        <w:trPr>
+          <w:tblHeader w:val="off"/>
+        </w:trPr>
+        <w:tc>
+          <w:tcPr>
+            <w:tcW w:type="dxa" w:w="2147"/>
+            <w:tcBorders>
+              <w:top w:val="single" w:color="000000" w:sz="4"/>
+              <w:left w:val="single" w:color="000000" w:sz="4"/>
+              <w:bottom w:val="single" w:color="000000" w:sz="4"/>
+              <w:right w:val="single" w:color="000000" w:sz="4"/>
+            </w:tcBorders>
+            <w:tcMar>
+              <w:top w:type="dxa" w:w="60"/>
+              <w:left w:type="dxa" w:w="100"/>
+              <w:bottom w:type="dxa" w:w="60"/>
+              <w:right w:type="dxa" w:w="100"/>
+            </w:tcMar>
+          </w:tcPr>
+          <w:p>
+            <w:pPr>
+              <w:jc w:val="left"/>
+            </w:pPr>
+            <w:r>
+              <w:rPr>
+                <w:rFonts w:ascii="Times New Roman" w:cs="Times New Roman" w:eastAsia="Times New Roman" w:hAnsi="Times New Roman"/>
+                <w:b w:val="false"/>
+                <w:bCs w:val="false"/>
+                <w:sz w:val="20"/>
+                <w:szCs w:val="20"/>
+              </w:rPr>
+              <w:t xml:space="preserve">GuardCode-ML</w:t>
+            </w:r>
+          </w:p>
+        </w:tc>
+        <w:tc>
+          <w:tcPr>
+            <w:tcW w:type="dxa" w:w="1431"/>
+            <w:tcBorders>
+              <w:top w:val="single" w:color="000000" w:sz="4"/>
+              <w:left w:val="single" w:color="000000" w:sz="4"/>
+              <w:bottom w:val="single" w:color="000000" w:sz="4"/>
+              <w:right w:val="single" w:color="000000" w:sz="4"/>
+            </w:tcBorders>
+            <w:tcMar>
+              <w:top w:type="dxa" w:w="60"/>
+              <w:left w:type="dxa" w:w="100"/>
+              <w:bottom w:type="dxa" w:w="60"/>
+              <w:right w:type="dxa" w:w="100"/>
+            </w:tcMar>
+          </w:tcPr>
+          <w:p>
+            <w:pPr>
+              <w:jc w:val="center"/>
+            </w:pPr>
+            <w:r>
+              <w:rPr>
+                <w:rFonts w:ascii="Times New Roman" w:cs="Times New Roman" w:eastAsia="Times New Roman" w:hAnsi="Times New Roman"/>
+                <w:b w:val="false"/>
+                <w:bCs w:val="false"/>
+                <w:sz w:val="20"/>
+                <w:szCs w:val="20"/>
+              </w:rPr>
+              <w:t xml:space="preserve">24,00,000</w:t>
+            </w:r>
+          </w:p>
+        </w:tc>
+        <w:tc>
+          <w:tcPr>
+            <w:tcW w:type="dxa" w:w="1431"/>
+            <w:tcBorders>
+              <w:top w:val="single" w:color="000000" w:sz="4"/>
+              <w:left w:val="single" w:color="000000" w:sz="4"/>
+              <w:bottom w:val="single" w:color="000000" w:sz="4"/>
+              <w:right w:val="single" w:color="000000" w:sz="4"/>
+            </w:tcBorders>
+            <w:tcMar>
+              <w:top w:type="dxa" w:w="60"/>
+              <w:left w:type="dxa" w:w="100"/>
+              <w:bottom w:type="dxa" w:w="60"/>
+              <w:right w:type="dxa" w:w="100"/>
+            </w:tcMar>
+          </w:tcPr>
+          <w:p>
+            <w:pPr>
+              <w:jc w:val="center"/>
+            </w:pPr>
+            <w:r>
+              <w:rPr>
+                <w:rFonts w:ascii="Times New Roman" w:cs="Times New Roman" w:eastAsia="Times New Roman" w:hAnsi="Times New Roman"/>
+                <w:b w:val="false"/>
+                <w:bCs w:val="false"/>
+                <w:sz w:val="20"/>
+                <w:szCs w:val="20"/>
+              </w:rPr>
+              <w:t xml:space="preserve">8,64,836</w:t>
+            </w:r>
+          </w:p>
+        </w:tc>
+        <w:tc>
+          <w:tcPr>
+            <w:tcW w:type="dxa" w:w="1431"/>
+            <w:tcBorders>
+              <w:top w:val="single" w:color="000000" w:sz="4"/>
+              <w:left w:val="single" w:color="000000" w:sz="4"/>
+              <w:bottom w:val="single" w:color="000000" w:sz="4"/>
+              <w:right w:val="single" w:color="000000" w:sz="4"/>
+            </w:tcBorders>
+            <w:tcMar>
+              <w:top w:type="dxa" w:w="60"/>
+              <w:left w:type="dxa" w:w="100"/>
+              <w:bottom w:type="dxa" w:w="60"/>
+              <w:right w:type="dxa" w:w="100"/>
+            </w:tcMar>
+          </w:tcPr>
+          <w:p>
+            <w:pPr>
+              <w:jc w:val="center"/>
+            </w:pPr>
+            <w:r>
+              <w:rPr>
+                <w:rFonts w:ascii="Times New Roman" w:cs="Times New Roman" w:eastAsia="Times New Roman" w:hAnsi="Times New Roman"/>
+                <w:b w:val="false"/>
+                <w:bCs w:val="false"/>
+                <w:sz w:val="20"/>
+                <w:szCs w:val="20"/>
+              </w:rPr>
+              <w:t xml:space="preserve">324</w:t>
+            </w:r>
+          </w:p>
+        </w:tc>
+        <w:tc>
+          <w:tcPr>
+            <w:tcW w:type="dxa" w:w="1431"/>
+            <w:tcBorders>
+              <w:top w:val="single" w:color="000000" w:sz="4"/>
+              <w:left w:val="single" w:color="000000" w:sz="4"/>
+              <w:bottom w:val="single" w:color="000000" w:sz="4"/>
+              <w:right w:val="single" w:color="000000" w:sz="4"/>
+            </w:tcBorders>
+            <w:tcMar>
+              <w:top w:type="dxa" w:w="60"/>
+              <w:left w:type="dxa" w:w="100"/>
+              <w:bottom w:type="dxa" w:w="60"/>
+              <w:right w:type="dxa" w:w="100"/>
+            </w:tcMar>
+          </w:tcPr>
+          <w:p>
+            <w:pPr>
+              <w:jc w:val="center"/>
+            </w:pPr>
+            <w:r>
+              <w:rPr>
+                <w:rFonts w:ascii="Times New Roman" w:cs="Times New Roman" w:eastAsia="Times New Roman" w:hAnsi="Times New Roman"/>
+                <w:b w:val="false"/>
+                <w:bCs w:val="false"/>
+                <w:sz w:val="20"/>
+                <w:szCs w:val="20"/>
+              </w:rPr>
+              <w:t xml:space="preserve">0.037</w:t>
+            </w:r>
+          </w:p>
+        </w:tc>
+        <w:tc>
+          <w:tcPr>
+            <w:tcW w:type="dxa" w:w="1435"/>
+            <w:tcBorders>
+              <w:top w:val="single" w:color="000000" w:sz="4"/>
+              <w:left w:val="single" w:color="000000" w:sz="4"/>
+              <w:bottom w:val="single" w:color="000000" w:sz="4"/>
+              <w:right w:val="single" w:color="000000" w:sz="4"/>
+            </w:tcBorders>
+            <w:tcMar>
+              <w:top w:type="dxa" w:w="60"/>
+              <w:left w:type="dxa" w:w="100"/>
+              <w:bottom w:type="dxa" w:w="60"/>
+              <w:right w:type="dxa" w:w="100"/>
+            </w:tcMar>
+          </w:tcPr>
+          <w:p>
+            <w:pPr>
+              <w:jc w:val="center"/>
+            </w:pPr>
+            <w:r>
+              <w:rPr>
+                <w:rFonts w:ascii="Times New Roman" w:cs="Times New Roman" w:eastAsia="Times New Roman" w:hAnsi="Times New Roman"/>
+                <w:b w:val="false"/>
+                <w:bCs w:val="false"/>
+                <w:sz w:val="20"/>
+                <w:szCs w:val="20"/>
+              </w:rPr>
+              <w:t xml:space="preserve">-</w:t>
             </w:r>
           </w:p>
         </w:tc>
@@ -8432,7 +8939,7 @@
       </w:tr>
       <w:tr>
         <w:trPr>
-          <w:tblHeader w:val="false"/>
+          <w:tblHeader w:val="off"/>
         </w:trPr>
         <w:tc>
           <w:tcPr>
@@ -8629,7 +9136,7 @@
       </w:tr>
       <w:tr>
         <w:trPr>
-          <w:tblHeader w:val="false"/>
+          <w:tblHeader w:val="off"/>
         </w:trPr>
         <w:tc>
           <w:tcPr>
@@ -8826,7 +9333,7 @@
       </w:tr>
       <w:tr>
         <w:trPr>
-          <w:tblHeader w:val="false"/>
+          <w:tblHeader w:val="off"/>
         </w:trPr>
         <w:tc>
           <w:tcPr>
@@ -9023,7 +9530,7 @@
       </w:tr>
       <w:tr>
         <w:trPr>
-          <w:tblHeader w:val="false"/>
+          <w:tblHeader w:val="off"/>
         </w:trPr>
         <w:tc>
           <w:tcPr>
@@ -9220,7 +9727,7 @@
       </w:tr>
       <w:tr>
         <w:trPr>
-          <w:tblHeader w:val="false"/>
+          <w:tblHeader w:val="off"/>
         </w:trPr>
         <w:tc>
           <w:tcPr>
@@ -9417,7 +9924,7 @@
       </w:tr>
       <w:tr>
         <w:trPr>
-          <w:tblHeader w:val="false"/>
+          <w:tblHeader w:val="off"/>
         </w:trPr>
         <w:tc>
           <w:tcPr>
@@ -9608,6 +10115,203 @@
                 <w:szCs w:val="20"/>
               </w:rPr>
               <w:t xml:space="preserve">1621</w:t>
+            </w:r>
+          </w:p>
+        </w:tc>
+      </w:tr>
+      <w:tr>
+        <w:trPr>
+          <w:tblHeader w:val="off"/>
+        </w:trPr>
+        <w:tc>
+          <w:tcPr>
+            <w:tcW w:type="dxa" w:w="2147"/>
+            <w:tcBorders>
+              <w:top w:val="single" w:color="000000" w:sz="4"/>
+              <w:left w:val="single" w:color="000000" w:sz="4"/>
+              <w:bottom w:val="single" w:color="000000" w:sz="4"/>
+              <w:right w:val="single" w:color="000000" w:sz="4"/>
+            </w:tcBorders>
+            <w:tcMar>
+              <w:top w:type="dxa" w:w="60"/>
+              <w:left w:type="dxa" w:w="100"/>
+              <w:bottom w:type="dxa" w:w="60"/>
+              <w:right w:type="dxa" w:w="100"/>
+            </w:tcMar>
+          </w:tcPr>
+          <w:p>
+            <w:pPr>
+              <w:jc w:val="left"/>
+            </w:pPr>
+            <w:r>
+              <w:rPr>
+                <w:rFonts w:ascii="Times New Roman" w:cs="Times New Roman" w:eastAsia="Times New Roman" w:hAnsi="Times New Roman"/>
+                <w:b w:val="false"/>
+                <w:bCs w:val="false"/>
+                <w:sz w:val="20"/>
+                <w:szCs w:val="20"/>
+              </w:rPr>
+              <w:t xml:space="preserve">GuardCode-ML</w:t>
+            </w:r>
+          </w:p>
+        </w:tc>
+        <w:tc>
+          <w:tcPr>
+            <w:tcW w:type="dxa" w:w="1431"/>
+            <w:tcBorders>
+              <w:top w:val="single" w:color="000000" w:sz="4"/>
+              <w:left w:val="single" w:color="000000" w:sz="4"/>
+              <w:bottom w:val="single" w:color="000000" w:sz="4"/>
+              <w:right w:val="single" w:color="000000" w:sz="4"/>
+            </w:tcBorders>
+            <w:tcMar>
+              <w:top w:type="dxa" w:w="60"/>
+              <w:left w:type="dxa" w:w="100"/>
+              <w:bottom w:type="dxa" w:w="60"/>
+              <w:right w:type="dxa" w:w="100"/>
+            </w:tcMar>
+          </w:tcPr>
+          <w:p>
+            <w:pPr>
+              <w:jc w:val="center"/>
+            </w:pPr>
+            <w:r>
+              <w:rPr>
+                <w:rFonts w:ascii="Times New Roman" w:cs="Times New Roman" w:eastAsia="Times New Roman" w:hAnsi="Times New Roman"/>
+                <w:b w:val="false"/>
+                <w:bCs w:val="false"/>
+                <w:sz w:val="20"/>
+                <w:szCs w:val="20"/>
+              </w:rPr>
+              <w:t xml:space="preserve">24,00,000</w:t>
+            </w:r>
+          </w:p>
+        </w:tc>
+        <w:tc>
+          <w:tcPr>
+            <w:tcW w:type="dxa" w:w="1431"/>
+            <w:tcBorders>
+              <w:top w:val="single" w:color="000000" w:sz="4"/>
+              <w:left w:val="single" w:color="000000" w:sz="4"/>
+              <w:bottom w:val="single" w:color="000000" w:sz="4"/>
+              <w:right w:val="single" w:color="000000" w:sz="4"/>
+            </w:tcBorders>
+            <w:tcMar>
+              <w:top w:type="dxa" w:w="60"/>
+              <w:left w:type="dxa" w:w="100"/>
+              <w:bottom w:type="dxa" w:w="60"/>
+              <w:right w:type="dxa" w:w="100"/>
+            </w:tcMar>
+          </w:tcPr>
+          <w:p>
+            <w:pPr>
+              <w:jc w:val="center"/>
+            </w:pPr>
+            <w:r>
+              <w:rPr>
+                <w:rFonts w:ascii="Times New Roman" w:cs="Times New Roman" w:eastAsia="Times New Roman" w:hAnsi="Times New Roman"/>
+                <w:b w:val="false"/>
+                <w:bCs w:val="false"/>
+                <w:sz w:val="20"/>
+                <w:szCs w:val="20"/>
+              </w:rPr>
+              <w:t xml:space="preserve">13,77,323</w:t>
+            </w:r>
+          </w:p>
+        </w:tc>
+        <w:tc>
+          <w:tcPr>
+            <w:tcW w:type="dxa" w:w="1431"/>
+            <w:tcBorders>
+              <w:top w:val="single" w:color="000000" w:sz="4"/>
+              <w:left w:val="single" w:color="000000" w:sz="4"/>
+              <w:bottom w:val="single" w:color="000000" w:sz="4"/>
+              <w:right w:val="single" w:color="000000" w:sz="4"/>
+            </w:tcBorders>
+            <w:tcMar>
+              <w:top w:type="dxa" w:w="60"/>
+              <w:left w:type="dxa" w:w="100"/>
+              <w:bottom w:type="dxa" w:w="60"/>
+              <w:right w:type="dxa" w:w="100"/>
+            </w:tcMar>
+          </w:tcPr>
+          <w:p>
+            <w:pPr>
+              <w:jc w:val="center"/>
+            </w:pPr>
+            <w:r>
+              <w:rPr>
+                <w:rFonts w:ascii="Times New Roman" w:cs="Times New Roman" w:eastAsia="Times New Roman" w:hAnsi="Times New Roman"/>
+                <w:b w:val="false"/>
+                <w:bCs w:val="false"/>
+                <w:sz w:val="20"/>
+                <w:szCs w:val="20"/>
+              </w:rPr>
+              <w:t xml:space="preserve">1,165</w:t>
+            </w:r>
+          </w:p>
+        </w:tc>
+        <w:tc>
+          <w:tcPr>
+            <w:tcW w:type="dxa" w:w="1431"/>
+            <w:tcBorders>
+              <w:top w:val="single" w:color="000000" w:sz="4"/>
+              <w:left w:val="single" w:color="000000" w:sz="4"/>
+              <w:bottom w:val="single" w:color="000000" w:sz="4"/>
+              <w:right w:val="single" w:color="000000" w:sz="4"/>
+            </w:tcBorders>
+            <w:tcMar>
+              <w:top w:type="dxa" w:w="60"/>
+              <w:left w:type="dxa" w:w="100"/>
+              <w:bottom w:type="dxa" w:w="60"/>
+              <w:right w:type="dxa" w:w="100"/>
+            </w:tcMar>
+          </w:tcPr>
+          <w:p>
+            <w:pPr>
+              <w:jc w:val="center"/>
+            </w:pPr>
+            <w:r>
+              <w:rPr>
+                <w:rFonts w:ascii="Times New Roman" w:cs="Times New Roman" w:eastAsia="Times New Roman" w:hAnsi="Times New Roman"/>
+                <w:b w:val="false"/>
+                <w:bCs w:val="false"/>
+                <w:sz w:val="20"/>
+                <w:szCs w:val="20"/>
+              </w:rPr>
+              <w:t xml:space="preserve">0.085</w:t>
+            </w:r>
+          </w:p>
+        </w:tc>
+        <w:tc>
+          <w:tcPr>
+            <w:tcW w:type="dxa" w:w="1435"/>
+            <w:tcBorders>
+              <w:top w:val="single" w:color="000000" w:sz="4"/>
+              <w:left w:val="single" w:color="000000" w:sz="4"/>
+              <w:bottom w:val="single" w:color="000000" w:sz="4"/>
+              <w:right w:val="single" w:color="000000" w:sz="4"/>
+            </w:tcBorders>
+            <w:tcMar>
+              <w:top w:type="dxa" w:w="60"/>
+              <w:left w:type="dxa" w:w="100"/>
+              <w:bottom w:type="dxa" w:w="60"/>
+              <w:right w:type="dxa" w:w="100"/>
+            </w:tcMar>
+          </w:tcPr>
+          <w:p>
+            <w:pPr>
+              <w:jc w:val="center"/>
+            </w:pPr>
+            <w:r>
+              <w:rPr>
+                <w:rFonts w:ascii="Times New Roman" w:cs="Times New Roman" w:eastAsia="Times New Roman" w:hAnsi="Times New Roman"/>
+                <w:b w:val="false"/>
+                <w:bCs w:val="false"/>
+                <w:sz w:val="20"/>
+                <w:szCs w:val="20"/>
+              </w:rPr>
+              <w:t xml:space="preserve">-</w:t>
             </w:r>
           </w:p>
         </w:tc>
@@ -9647,7 +10351,7 @@
           <wp:inline distT="0" distB="0" distL="0" distR="0">
             <wp:extent cx="4953000" cy="2228850"/>
             <wp:effectExtent t="0" r="0" b="0" l="0"/>
-            <wp:docPr id="1" name="" descr="" title=""/>
+            <wp:docPr id="4" name=""/>
             <wp:cNvGraphicFramePr>
               <a:graphicFrameLocks xmlns:a="http://schemas.openxmlformats.org/drawingml/2006/main" noChangeAspect="1"/>
             </wp:cNvGraphicFramePr>
@@ -9776,7 +10480,7 @@
           <wp:inline distT="0" distB="0" distL="0" distR="0">
             <wp:extent cx="4095750" cy="2905125"/>
             <wp:effectExtent t="0" r="0" b="0" l="0"/>
-            <wp:docPr id="1" name="" descr="" title=""/>
+            <wp:docPr id="5" name=""/>
             <wp:cNvGraphicFramePr>
               <a:graphicFrameLocks xmlns:a="http://schemas.openxmlformats.org/drawingml/2006/main" noChangeAspect="1"/>
             </wp:cNvGraphicFramePr>
@@ -9837,7 +10541,7 @@
           <wp:inline distT="0" distB="0" distL="0" distR="0">
             <wp:extent cx="4095750" cy="2905125"/>
             <wp:effectExtent t="0" r="0" b="0" l="0"/>
-            <wp:docPr id="1" name="" descr="" title=""/>
+            <wp:docPr id="6" name=""/>
             <wp:cNvGraphicFramePr>
               <a:graphicFrameLocks xmlns:a="http://schemas.openxmlformats.org/drawingml/2006/main" noChangeAspect="1"/>
             </wp:cNvGraphicFramePr>
@@ -10107,7 +10811,7 @@
       </w:tr>
       <w:tr>
         <w:trPr>
-          <w:tblHeader w:val="false"/>
+          <w:tblHeader w:val="off"/>
         </w:trPr>
         <w:tc>
           <w:tcPr>
@@ -10304,7 +11008,7 @@
       </w:tr>
       <w:tr>
         <w:trPr>
-          <w:tblHeader w:val="false"/>
+          <w:tblHeader w:val="off"/>
         </w:trPr>
         <w:tc>
           <w:tcPr>
@@ -10501,7 +11205,7 @@
       </w:tr>
       <w:tr>
         <w:trPr>
-          <w:tblHeader w:val="false"/>
+          <w:tblHeader w:val="off"/>
         </w:trPr>
         <w:tc>
           <w:tcPr>
@@ -10698,7 +11402,7 @@
       </w:tr>
       <w:tr>
         <w:trPr>
-          <w:tblHeader w:val="false"/>
+          <w:tblHeader w:val="off"/>
         </w:trPr>
         <w:tc>
           <w:tcPr>
@@ -10927,7 +11631,7 @@
           <wp:inline distT="0" distB="0" distL="0" distR="0">
             <wp:extent cx="3619500" cy="3000375"/>
             <wp:effectExtent t="0" r="0" b="0" l="0"/>
-            <wp:docPr id="1" name="" descr="" title=""/>
+            <wp:docPr id="7" name=""/>
             <wp:cNvGraphicFramePr>
               <a:graphicFrameLocks xmlns:a="http://schemas.openxmlformats.org/drawingml/2006/main" noChangeAspect="1"/>
             </wp:cNvGraphicFramePr>
@@ -11066,7 +11770,7 @@
           <wp:inline distT="0" distB="0" distL="0" distR="0">
             <wp:extent cx="4953000" cy="3314700"/>
             <wp:effectExtent t="0" r="0" b="0" l="0"/>
-            <wp:docPr id="1" name="" descr="" title=""/>
+            <wp:docPr id="8" name=""/>
             <wp:cNvGraphicFramePr>
               <a:graphicFrameLocks xmlns:a="http://schemas.openxmlformats.org/drawingml/2006/main" noChangeAspect="1"/>
             </wp:cNvGraphicFramePr>
@@ -11145,6 +11849,23 @@
     </w:p>
     <w:p>
       <w:pPr>
+        <w:pStyle w:val="Heading2"/>
+      </w:pPr>
+      <w:r>
+        <w:t xml:space="preserve">6.7 Learned gate: GuardCode-ML</w:t>
+      </w:r>
+    </w:p>
+    <w:p>
+      <w:pPr>
+        <w:spacing w:after="120" w:line="300"/>
+        <w:jc w:val="both"/>
+      </w:pPr>
+      <w:r>
+        <w:t xml:space="preserve">Pooled over Eb/N0 = 0-7 dB at the same retransmission budget, GuardCode-ML left 324 undetected frames on AWGN against 742 for the Soft-Syndrome Guard (56 % fewer) and 1,165 against 1,531 on the burst channel (24 % fewer). Relative to the classic min-|LLR| test the reductions are 77 % (AWGN) and 62 % (burst). Goodput is unchanged to within about 0.1 % from 3 dB upward. The classifier is trained on a limited number of wrong frames, so the gain should be confirmed with larger runs before it is claimed as general.</w:t>
+      </w:r>
+    </w:p>
+    <w:p>
+      <w:pPr>
         <w:pStyle w:val="Heading1"/>
       </w:pPr>
       <w:r>
@@ -11238,7 +11959,7 @@
       </w:tr>
       <w:tr>
         <w:trPr>
-          <w:tblHeader w:val="false"/>
+          <w:tblHeader w:val="off"/>
         </w:trPr>
         <w:tc>
           <w:tcPr>
@@ -11307,7 +12028,7 @@
       </w:tr>
       <w:tr>
         <w:trPr>
-          <w:tblHeader w:val="false"/>
+          <w:tblHeader w:val="off"/>
         </w:trPr>
         <w:tc>
           <w:tcPr>
@@ -11376,7 +12097,7 @@
       </w:tr>
       <w:tr>
         <w:trPr>
-          <w:tblHeader w:val="false"/>
+          <w:tblHeader w:val="off"/>
         </w:trPr>
         <w:tc>
           <w:tcPr>
@@ -11445,7 +12166,7 @@
       </w:tr>
       <w:tr>
         <w:trPr>
-          <w:tblHeader w:val="false"/>
+          <w:tblHeader w:val="off"/>
         </w:trPr>
         <w:tc>
           <w:tcPr>
@@ -13139,7 +13860,7 @@
       </w:r>
     </w:p>
     <w:sectPr>
-      <w:footerReference w:type="default" r:id="rId7"/>
+      <w:footerReference w:type="default" r:id="rId6"/>
       <w:pgSz w:w="11906" w:h="16838" w:orient="portrait"/>
       <w:pgMar w:top="1300" w:right="1300" w:bottom="1300" w:left="1300" w:header="708" w:footer="708" w:gutter="0"/>
       <w:pgNumType/>
@@ -13147,10 +13868,6 @@
     </w:sectPr>
   </w:body>
 </w:document>
-</file>
-
-<file path=word/comments.xml><?xml version="1.0" encoding="utf-8"?>
-<w:comments xmlns:cx="http://schemas.microsoft.com/office/drawing/2014/chartex" xmlns:cx1="http://schemas.microsoft.com/office/drawing/2015/9/8/chartex" xmlns:cx2="http://schemas.microsoft.com/office/drawing/2015/10/21/chartex" xmlns:cx3="http://schemas.microsoft.com/office/drawing/2016/5/9/chartex" xmlns:cx4="http://schemas.microsoft.com/office/drawing/2016/5/10/chartex" xmlns:cx5="http://schemas.microsoft.com/office/drawing/2016/5/11/chartex" xmlns:cx6="http://schemas.microsoft.com/office/drawing/2016/5/12/chartex" xmlns:cx7="http://schemas.microsoft.com/office/drawing/2016/5/13/chartex" xmlns:cx8="http://schemas.microsoft.com/office/drawing/2016/5/14/chartex" xmlns:mc="http://schemas.openxmlformats.org/markup-compatibility/2006" xmlns:aink="http://schemas.microsoft.com/office/drawing/2016/ink" xmlns:am3d="http://schemas.microsoft.com/office/drawing/2017/model3d" xmlns:o="urn:schemas-microsoft-com:office:office" xmlns:r="http://schemas.openxmlformats.org/officeDocument/2006/relationships" xmlns:m="http://schemas.openxmlformats.org/officeDocument/2006/math" xmlns:v="urn:schemas-microsoft-com:vml" xmlns:wp14="http://schemas.microsoft.com/office/word/2010/wordprocessingDrawing" xmlns:wp="http://schemas.openxmlformats.org/drawingml/2006/wordprocessingDrawing" xmlns:w10="urn:schemas-microsoft-com:office:word" xmlns:w="http://schemas.openxmlformats.org/wordprocessingml/2006/main" xmlns:w14="http://schemas.microsoft.com/office/word/2010/wordml" xmlns:w15="http://schemas.microsoft.com/office/word/2012/wordml" xmlns:w16cex="http://schemas.microsoft.com/office/word/2018/wordml/cex" xmlns:w16cid="http://schemas.microsoft.com/office/word/2016/wordml/cid" xmlns:w16="http://schemas.microsoft.com/office/word/2018/wordml" xmlns:w16sdtdh="http://schemas.microsoft.com/office/word/2020/wordml/sdtdatahash" xmlns:w16se="http://schemas.microsoft.com/office/word/2015/wordml/symex" xmlns:wpg="http://schemas.microsoft.com/office/word/2010/wordprocessingGroup" xmlns:wpi="http://schemas.microsoft.com/office/word/2010/wordprocessingInk" xmlns:wne="http://schemas.microsoft.com/office/word/2006/wordml" xmlns:wps="http://schemas.microsoft.com/office/word/2010/wordprocessingShape"/>
 </file>
 
 <file path=word/endnotes.xml><?xml version="1.0" encoding="utf-8"?>
@@ -13202,8 +13919,26 @@
         <w:szCs w:val="20"/>
       </w:rPr>
       <w:fldChar w:fldCharType="begin"/>
+    </w:r>
+    <w:r>
+      <w:rPr>
+        <w:sz w:val="20"/>
+        <w:szCs w:val="20"/>
+      </w:rPr>
       <w:instrText xml:space="preserve">PAGE</w:instrText>
+    </w:r>
+    <w:r>
+      <w:rPr>
+        <w:sz w:val="20"/>
+        <w:szCs w:val="20"/>
+      </w:rPr>
       <w:fldChar w:fldCharType="separate"/>
+    </w:r>
+    <w:r>
+      <w:rPr>
+        <w:sz w:val="20"/>
+        <w:szCs w:val="20"/>
+      </w:rPr>
       <w:fldChar w:fldCharType="end"/>
     </w:r>
   </w:p>
@@ -13251,7 +13986,7 @@
 <w:numbering xmlns:wpc="http://schemas.microsoft.com/office/word/2010/wordprocessingCanvas" xmlns:mc="http://schemas.openxmlformats.org/markup-compatibility/2006" xmlns:o="urn:schemas-microsoft-com:office:office" xmlns:r="http://schemas.openxmlformats.org/officeDocument/2006/relationships" xmlns:m="http://schemas.openxmlformats.org/officeDocument/2006/math" xmlns:v="urn:schemas-microsoft-com:vml" xmlns:wp14="http://schemas.microsoft.com/office/word/2010/wordprocessingDrawing" xmlns:wp="http://schemas.openxmlformats.org/drawingml/2006/wordprocessingDrawing" xmlns:w10="urn:schemas-microsoft-com:office:word" xmlns:w="http://schemas.openxmlformats.org/wordprocessingml/2006/main" xmlns:w14="http://schemas.microsoft.com/office/word/2010/wordml" xmlns:w15="http://schemas.microsoft.com/office/word/2012/wordml" xmlns:wpg="http://schemas.microsoft.com/office/word/2010/wordprocessingGroup" xmlns:wpi="http://schemas.microsoft.com/office/word/2010/wordprocessingInk" xmlns:wne="http://schemas.microsoft.com/office/word/2006/wordml" xmlns:wps="http://schemas.microsoft.com/office/word/2010/wordprocessingShape" mc:Ignorable="w14 w15 wp14">
   <w:abstractNum w:abstractNumId="1" w15:restartNumberingAfterBreak="0">
     <w:multiLevelType w:val="hybridMultilevel"/>
-    <w:lvl w:ilvl="0" w15:tentative="1">
+    <w:lvl w:ilvl="0" w:tentative="1">
       <w:start w:val="1"/>
       <w:numFmt w:val="bullet"/>
       <w:lvlText w:val="●"/>
@@ -13260,7 +13995,7 @@
         <w:ind w:left="720" w:hanging="360"/>
       </w:pPr>
     </w:lvl>
-    <w:lvl w:ilvl="1" w15:tentative="1">
+    <w:lvl w:ilvl="1" w:tentative="1">
       <w:start w:val="1"/>
       <w:numFmt w:val="bullet"/>
       <w:lvlText w:val="○"/>
@@ -13269,7 +14004,7 @@
         <w:ind w:left="1440" w:hanging="360"/>
       </w:pPr>
     </w:lvl>
-    <w:lvl w:ilvl="2" w15:tentative="1">
+    <w:lvl w:ilvl="2" w:tentative="1">
       <w:start w:val="1"/>
       <w:numFmt w:val="bullet"/>
       <w:lvlText w:val="■"/>
@@ -13278,7 +14013,7 @@
         <w:ind w:left="2160" w:hanging="360"/>
       </w:pPr>
     </w:lvl>
-    <w:lvl w:ilvl="3" w15:tentative="1">
+    <w:lvl w:ilvl="3" w:tentative="1">
       <w:start w:val="1"/>
       <w:numFmt w:val="bullet"/>
       <w:lvlText w:val="●"/>
@@ -13287,7 +14022,7 @@
         <w:ind w:left="2880" w:hanging="360"/>
       </w:pPr>
     </w:lvl>
-    <w:lvl w:ilvl="4" w15:tentative="1">
+    <w:lvl w:ilvl="4" w:tentative="1">
       <w:start w:val="1"/>
       <w:numFmt w:val="bullet"/>
       <w:lvlText w:val="○"/>
@@ -13296,7 +14031,7 @@
         <w:ind w:left="3600" w:hanging="360"/>
       </w:pPr>
     </w:lvl>
-    <w:lvl w:ilvl="5" w15:tentative="1">
+    <w:lvl w:ilvl="5" w:tentative="1">
       <w:start w:val="1"/>
       <w:numFmt w:val="bullet"/>
       <w:lvlText w:val="■"/>
@@ -13305,7 +14040,7 @@
         <w:ind w:left="4320" w:hanging="360"/>
       </w:pPr>
     </w:lvl>
-    <w:lvl w:ilvl="6" w15:tentative="1">
+    <w:lvl w:ilvl="6" w:tentative="1">
       <w:start w:val="1"/>
       <w:numFmt w:val="bullet"/>
       <w:lvlText w:val="●"/>
@@ -13314,7 +14049,7 @@
         <w:ind w:left="5040" w:hanging="360"/>
       </w:pPr>
     </w:lvl>
-    <w:lvl w:ilvl="7" w15:tentative="1">
+    <w:lvl w:ilvl="7" w:tentative="1">
       <w:start w:val="1"/>
       <w:numFmt w:val="bullet"/>
       <w:lvlText w:val="●"/>
@@ -13323,7 +14058,7 @@
         <w:ind w:left="5760" w:hanging="360"/>
       </w:pPr>
     </w:lvl>
-    <w:lvl w:ilvl="8" w15:tentative="1">
+    <w:lvl w:ilvl="8" w:tentative="1">
       <w:start w:val="1"/>
       <w:numFmt w:val="bullet"/>
       <w:lvlText w:val="●"/>
@@ -13335,7 +14070,7 @@
   </w:abstractNum>
   <w:abstractNum w:abstractNumId="2" w15:restartNumberingAfterBreak="0">
     <w:multiLevelType w:val="hybridMultilevel"/>
-    <w:lvl w:ilvl="0" w15:tentative="1">
+    <w:lvl w:ilvl="0" w:tentative="1">
       <w:start w:val="1"/>
       <w:numFmt w:val="bullet"/>
       <w:lvlText w:val="•"/>
@@ -13347,7 +14082,7 @@
   </w:abstractNum>
   <w:abstractNum w:abstractNumId="3" w15:restartNumberingAfterBreak="0">
     <w:multiLevelType w:val="hybridMultilevel"/>
-    <w:lvl w:ilvl="0" w15:tentative="1">
+    <w:lvl w:ilvl="0" w:tentative="1">
       <w:start w:val="1"/>
       <w:numFmt w:val="decimal"/>
       <w:lvlText w:val="%1."/>
@@ -13359,7 +14094,7 @@
   </w:abstractNum>
   <w:abstractNum w:abstractNumId="4" w15:restartNumberingAfterBreak="0">
     <w:multiLevelType w:val="hybridMultilevel"/>
-    <w:lvl w:ilvl="0" w15:tentative="1">
+    <w:lvl w:ilvl="0" w:tentative="1">
       <w:start w:val="1"/>
       <w:numFmt w:val="decimal"/>
       <w:lvlText w:val="%1."/>
@@ -13371,7 +14106,7 @@
   </w:abstractNum>
   <w:abstractNum w:abstractNumId="5" w15:restartNumberingAfterBreak="0">
     <w:multiLevelType w:val="hybridMultilevel"/>
-    <w:lvl w:ilvl="0" w15:tentative="1">
+    <w:lvl w:ilvl="0" w:tentative="1">
       <w:start w:val="1"/>
       <w:numFmt w:val="decimal"/>
       <w:lvlText w:val="%1."/>
@@ -13383,7 +14118,7 @@
   </w:abstractNum>
   <w:abstractNum w:abstractNumId="6" w15:restartNumberingAfterBreak="0">
     <w:multiLevelType w:val="hybridMultilevel"/>
-    <w:lvl w:ilvl="0" w15:tentative="1">
+    <w:lvl w:ilvl="0" w:tentative="1">
       <w:start w:val="1"/>
       <w:numFmt w:val="decimal"/>
       <w:lvlText w:val="%1."/>
@@ -13395,7 +14130,7 @@
   </w:abstractNum>
   <w:abstractNum w:abstractNumId="7" w15:restartNumberingAfterBreak="0">
     <w:multiLevelType w:val="hybridMultilevel"/>
-    <w:lvl w:ilvl="0" w15:tentative="1">
+    <w:lvl w:ilvl="0" w:tentative="1">
       <w:start w:val="1"/>
       <w:numFmt w:val="decimal"/>
       <w:lvlText w:val="%1."/>
@@ -13445,6 +14180,25 @@
     </w:rPrDefault>
     <w:pPrDefault/>
   </w:docDefaults>
+  <w:style w:type="paragraph" w:styleId="Normal" w:default="1">
+    <w:name w:val="Normal"/>
+    <w:qFormat/>
+  </w:style>
+  <w:style w:type="table" w:styleId="TableNormal" w:default="true">
+    <w:name w:val="Normal Table"/>
+    <w:uiPriority w:val="99"/>
+    <w:semiHidden/>
+    <w:unhideWhenUsed/>
+    <w:tblPr>
+      <w:tblInd w:type="dxa" w:w="0"/>
+      <w:tblCellMar>
+        <w:top w:type="dxa" w:w="0"/>
+        <w:left w:type="dxa" w:w="108"/>
+        <w:bottom w:type="dxa" w:w="0"/>
+        <w:right w:type="dxa" w:w="108"/>
+      </w:tblCellMar>
+    </w:tblPr>
+  </w:style>
   <w:style w:type="paragraph" w:styleId="Title">
     <w:name w:val="Title"/>
     <w:basedOn w:val="Normal"/>
@@ -13453,39 +14207,6 @@
     <w:rPr>
       <w:sz w:val="56"/>
       <w:szCs w:val="56"/>
-    </w:rPr>
-  </w:style>
-  <w:style w:type="paragraph" w:styleId="Heading1">
-    <w:name w:val="Heading 1"/>
-    <w:basedOn w:val="Normal"/>
-    <w:next w:val="Normal"/>
-    <w:qFormat/>
-    <w:rPr>
-      <w:color w:val="2E74B5"/>
-      <w:sz w:val="32"/>
-      <w:szCs w:val="32"/>
-    </w:rPr>
-  </w:style>
-  <w:style w:type="paragraph" w:styleId="Heading2">
-    <w:name w:val="Heading 2"/>
-    <w:basedOn w:val="Normal"/>
-    <w:next w:val="Normal"/>
-    <w:qFormat/>
-    <w:rPr>
-      <w:color w:val="2E74B5"/>
-      <w:sz w:val="26"/>
-      <w:szCs w:val="26"/>
-    </w:rPr>
-  </w:style>
-  <w:style w:type="paragraph" w:styleId="Heading3">
-    <w:name w:val="Heading 3"/>
-    <w:basedOn w:val="Normal"/>
-    <w:next w:val="Normal"/>
-    <w:qFormat/>
-    <w:rPr>
-      <w:color w:val="1F4D78"/>
-      <w:sz w:val="24"/>
-      <w:szCs w:val="24"/>
     </w:rPr>
   </w:style>
   <w:style w:type="paragraph" w:styleId="Heading4">
@@ -13531,6 +14252,139 @@
     <w:name w:val="List Paragraph"/>
     <w:basedOn w:val="Normal"/>
     <w:qFormat/>
+  </w:style>
+  <w:style w:type="paragraph" w:styleId="Caption">
+    <w:name w:val="caption"/>
+    <w:basedOn w:val="Normal"/>
+    <w:next w:val="Normal"/>
+    <w:uiPriority w:val="35"/>
+    <w:semiHidden/>
+    <w:unhideWhenUsed/>
+    <w:qFormat/>
+    <w:pPr>
+      <w:spacing w:after="200"/>
+    </w:pPr>
+    <w:rPr>
+      <w:i/>
+      <w:iCs/>
+      <w:color w:val="44546A" w:themeColor="dark2"/>
+      <w:sz w:val="18"/>
+      <w:szCs w:val="18"/>
+    </w:rPr>
+  </w:style>
+  <w:style w:type="paragraph" w:styleId="Bibliography">
+    <w:name w:val="Bibliography"/>
+    <w:basedOn w:val="Normal"/>
+    <w:next w:val="Normal"/>
+    <w:uiPriority w:val="37"/>
+    <w:unhideWhenUsed/>
+  </w:style>
+  <w:style w:type="paragraph" w:styleId="TOC1">
+    <w:name w:val="toc 1"/>
+    <w:basedOn w:val="Normal"/>
+    <w:next w:val="Normal"/>
+    <w:uiPriority w:val="39"/>
+    <w:semiHidden/>
+    <w:unhideWhenUsed/>
+    <w:pPr>
+      <w:spacing w:after="100"/>
+    </w:pPr>
+  </w:style>
+  <w:style w:type="paragraph" w:styleId="TOC2">
+    <w:name w:val="toc 2"/>
+    <w:basedOn w:val="Normal"/>
+    <w:next w:val="Normal"/>
+    <w:uiPriority w:val="39"/>
+    <w:semiHidden/>
+    <w:unhideWhenUsed/>
+    <w:pPr>
+      <w:spacing w:after="100"/>
+      <w:ind w:left="240"/>
+    </w:pPr>
+  </w:style>
+  <w:style w:type="paragraph" w:styleId="TOC3">
+    <w:name w:val="toc 3"/>
+    <w:basedOn w:val="Normal"/>
+    <w:next w:val="Normal"/>
+    <w:uiPriority w:val="39"/>
+    <w:semiHidden/>
+    <w:unhideWhenUsed/>
+    <w:pPr>
+      <w:spacing w:after="100"/>
+      <w:ind w:left="480"/>
+    </w:pPr>
+  </w:style>
+  <w:style w:type="paragraph" w:styleId="TOC4">
+    <w:name w:val="toc 4"/>
+    <w:basedOn w:val="Normal"/>
+    <w:next w:val="Normal"/>
+    <w:uiPriority w:val="39"/>
+    <w:semiHidden/>
+    <w:unhideWhenUsed/>
+    <w:pPr>
+      <w:spacing w:after="100"/>
+      <w:ind w:left="720"/>
+    </w:pPr>
+  </w:style>
+  <w:style w:type="paragraph" w:styleId="TOC5">
+    <w:name w:val="toc 5"/>
+    <w:basedOn w:val="Normal"/>
+    <w:next w:val="Normal"/>
+    <w:uiPriority w:val="39"/>
+    <w:semiHidden/>
+    <w:unhideWhenUsed/>
+    <w:pPr>
+      <w:spacing w:after="100"/>
+      <w:ind w:left="960"/>
+    </w:pPr>
+  </w:style>
+  <w:style w:type="paragraph" w:styleId="TOC6">
+    <w:name w:val="toc 6"/>
+    <w:basedOn w:val="Normal"/>
+    <w:next w:val="Normal"/>
+    <w:uiPriority w:val="39"/>
+    <w:semiHidden/>
+    <w:unhideWhenUsed/>
+    <w:pPr>
+      <w:spacing w:after="100"/>
+      <w:ind w:left="1200"/>
+    </w:pPr>
+  </w:style>
+  <w:style w:type="paragraph" w:styleId="TOC7">
+    <w:name w:val="toc 7"/>
+    <w:basedOn w:val="Normal"/>
+    <w:next w:val="Normal"/>
+    <w:uiPriority w:val="39"/>
+    <w:semiHidden/>
+    <w:unhideWhenUsed/>
+    <w:pPr>
+      <w:spacing w:after="100"/>
+      <w:ind w:left="1440"/>
+    </w:pPr>
+  </w:style>
+  <w:style w:type="paragraph" w:styleId="TOC8">
+    <w:name w:val="toc 8"/>
+    <w:basedOn w:val="Normal"/>
+    <w:next w:val="Normal"/>
+    <w:uiPriority w:val="39"/>
+    <w:semiHidden/>
+    <w:unhideWhenUsed/>
+    <w:pPr>
+      <w:spacing w:after="100"/>
+      <w:ind w:left="1680"/>
+    </w:pPr>
+  </w:style>
+  <w:style w:type="paragraph" w:styleId="TOC9">
+    <w:name w:val="toc 9"/>
+    <w:basedOn w:val="Normal"/>
+    <w:next w:val="Normal"/>
+    <w:uiPriority w:val="39"/>
+    <w:semiHidden/>
+    <w:unhideWhenUsed/>
+    <w:pPr>
+      <w:spacing w:after="100"/>
+      <w:ind w:left="1920"/>
+    </w:pPr>
   </w:style>
   <w:style w:type="character" w:styleId="Hyperlink">
     <w:name w:val="Hyperlink"/>
@@ -13616,6 +14470,13 @@
       <w:szCs w:val="20"/>
     </w:rPr>
   </w:style>
+  <w:style w:type="character" w:styleId="LineNumber">
+    <w:name w:val="line number"/>
+    <w:basedOn w:val="DefaultParagraphFont"/>
+    <w:uiPriority w:val="99"/>
+    <w:semiHidden/>
+    <w:unhideWhenUsed/>
+  </w:style>
   <w:style w:type="paragraph" w:styleId="Heading1">
     <w:name w:val="Heading 1"/>
     <w:basedOn w:val="Normal"/>
@@ -13673,4 +14534,294 @@
     </w:rPr>
   </w:style>
 </w:styles>
+</file>
+
+<file path=word/theme/theme1.xml><?xml version="1.0" encoding="utf-8"?>
+<a:theme xmlns:a="http://schemas.openxmlformats.org/drawingml/2006/main" name="Office Theme">
+  <a:themeElements>
+    <a:clrScheme name="Office">
+      <a:dk1>
+        <a:sysClr val="windowText" lastClr="000000"/>
+      </a:dk1>
+      <a:lt1>
+        <a:sysClr val="window" lastClr="FFFFFF"/>
+      </a:lt1>
+      <a:dk2>
+        <a:srgbClr val="44546A"/>
+      </a:dk2>
+      <a:lt2>
+        <a:srgbClr val="E7E6E6"/>
+      </a:lt2>
+      <a:accent1>
+        <a:srgbClr val="4472C4"/>
+      </a:accent1>
+      <a:accent2>
+        <a:srgbClr val="ED7D31"/>
+      </a:accent2>
+      <a:accent3>
+        <a:srgbClr val="A5A5A5"/>
+      </a:accent3>
+      <a:accent4>
+        <a:srgbClr val="FFC000"/>
+      </a:accent4>
+      <a:accent5>
+        <a:srgbClr val="5B9BD5"/>
+      </a:accent5>
+      <a:accent6>
+        <a:srgbClr val="70AD47"/>
+      </a:accent6>
+      <a:hlink>
+        <a:srgbClr val="0563C1"/>
+      </a:hlink>
+      <a:folHlink>
+        <a:srgbClr val="954F72"/>
+      </a:folHlink>
+    </a:clrScheme>
+    <a:fontScheme name="Office">
+      <a:majorFont>
+        <a:latin typeface="Calibri Light" panose="020F0302020204030204"/>
+        <a:ea typeface=""/>
+        <a:cs typeface=""/>
+        <a:font script="Jpan" typeface="游ゴシック Light"/>
+        <a:font script="Hang" typeface="맑은 고딕"/>
+        <a:font script="Hans" typeface="等线 Light"/>
+        <a:font script="Hant" typeface="新細明體"/>
+        <a:font script="Arab" typeface="Times New Roman"/>
+        <a:font script="Hebr" typeface="Times New Roman"/>
+        <a:font script="Thai" typeface="Angsana New"/>
+        <a:font script="Ethi" typeface="Nyala"/>
+        <a:font script="Beng" typeface="Vrinda"/>
+        <a:font script="Gujr" typeface="Shruti"/>
+        <a:font script="Khmr" typeface="MoolBoran"/>
+        <a:font script="Knda" typeface="Tunga"/>
+        <a:font script="Guru" typeface="Raavi"/>
+        <a:font script="Cans" typeface="Euphemia"/>
+        <a:font script="Cher" typeface="Plantagenet Cherokee"/>
+        <a:font script="Yiii" typeface="Microsoft Yi Baiti"/>
+        <a:font script="Tibt" typeface="Microsoft Himalaya"/>
+        <a:font script="Thaa" typeface="MV Boli"/>
+        <a:font script="Deva" typeface="Mangal"/>
+        <a:font script="Telu" typeface="Gautami"/>
+        <a:font script="Taml" typeface="Latha"/>
+        <a:font script="Syrc" typeface="Estrangelo Edessa"/>
+        <a:font script="Orya" typeface="Kalinga"/>
+        <a:font script="Mlym" typeface="Kartika"/>
+        <a:font script="Laoo" typeface="DokChampa"/>
+        <a:font script="Sinh" typeface="Iskoola Pota"/>
+        <a:font script="Mong" typeface="Mongolian Baiti"/>
+        <a:font script="Viet" typeface="Times New Roman"/>
+        <a:font script="Uigh" typeface="Microsoft Uighur"/>
+        <a:font script="Geor" typeface="Sylfaen"/>
+        <a:font script="Armn" typeface="Arial"/>
+        <a:font script="Bugi" typeface="Leelawadee UI"/>
+        <a:font script="Bopo" typeface="Microsoft JhengHei"/>
+        <a:font script="Java" typeface="Javanese Text"/>
+        <a:font script="Lisu" typeface="Segoe UI"/>
+        <a:font script="Mymr" typeface="Myanmar Text"/>
+        <a:font script="Nkoo" typeface="Ebrima"/>
+        <a:font script="Olck" typeface="Nirmala UI"/>
+        <a:font script="Osma" typeface="Ebrima"/>
+        <a:font script="Phag" typeface="Phagspa"/>
+        <a:font script="Syrn" typeface="Estrangelo Edessa"/>
+        <a:font script="Syrj" typeface="Estrangelo Edessa"/>
+        <a:font script="Syre" typeface="Estrangelo Edessa"/>
+        <a:font script="Sora" typeface="Nirmala UI"/>
+        <a:font script="Tale" typeface="Microsoft Tai Le"/>
+        <a:font script="Talu" typeface="Microsoft New Tai Lue"/>
+        <a:font script="Tfng" typeface="Ebrima"/>
+      </a:majorFont>
+      <a:minorFont>
+        <a:latin typeface="Calibri" panose="020F0502020204030204"/>
+        <a:ea typeface=""/>
+        <a:cs typeface=""/>
+        <a:font script="Jpan" typeface="游明朝"/>
+        <a:font script="Hang" typeface="맑은 고딕"/>
+        <a:font script="Hans" typeface="等线"/>
+        <a:font script="Hant" typeface="新細明體"/>
+        <a:font script="Arab" typeface="Arial"/>
+        <a:font script="Hebr" typeface="Arial"/>
+        <a:font script="Thai" typeface="Cordia New"/>
+        <a:font script="Ethi" typeface="Nyala"/>
+        <a:font script="Beng" typeface="Vrinda"/>
+        <a:font script="Gujr" typeface="Shruti"/>
+        <a:font script="Khmr" typeface="DaunPenh"/>
+        <a:font script="Knda" typeface="Tunga"/>
+        <a:font script="Guru" typeface="Raavi"/>
+        <a:font script="Cans" typeface="Euphemia"/>
+        <a:font script="Cher" typeface="Plantagenet Cherokee"/>
+        <a:font script="Yiii" typeface="Microsoft Yi Baiti"/>
+        <a:font script="Tibt" typeface="Microsoft Himalaya"/>
+        <a:font script="Thaa" typeface="MV Boli"/>
+        <a:font script="Deva" typeface="Mangal"/>
+        <a:font script="Telu" typeface="Gautami"/>
+        <a:font script="Taml" typeface="Latha"/>
+        <a:font script="Syrc" typeface="Estrangelo Edessa"/>
+        <a:font script="Orya" typeface="Kalinga"/>
+        <a:font script="Mlym" typeface="Kartika"/>
+        <a:font script="Laoo" typeface="DokChampa"/>
+        <a:font script="Sinh" typeface="Iskoola Pota"/>
+        <a:font script="Mong" typeface="Mongolian Baiti"/>
+        <a:font script="Viet" typeface="Arial"/>
+        <a:font script="Uigh" typeface="Microsoft Uighur"/>
+        <a:font script="Geor" typeface="Sylfaen"/>
+        <a:font script="Armn" typeface="Arial"/>
+        <a:font script="Bugi" typeface="Leelawadee UI"/>
+        <a:font script="Bopo" typeface="Microsoft JhengHei"/>
+        <a:font script="Java" typeface="Javanese Text"/>
+        <a:font script="Lisu" typeface="Segoe UI"/>
+        <a:font script="Mymr" typeface="Myanmar Text"/>
+        <a:font script="Nkoo" typeface="Ebrima"/>
+        <a:font script="Olck" typeface="Nirmala UI"/>
+        <a:font script="Osma" typeface="Ebrima"/>
+        <a:font script="Phag" typeface="Phagspa"/>
+        <a:font script="Syrn" typeface="Estrangelo Edessa"/>
+        <a:font script="Syrj" typeface="Estrangelo Edessa"/>
+        <a:font script="Syre" typeface="Estrangelo Edessa"/>
+        <a:font script="Sora" typeface="Nirmala UI"/>
+        <a:font script="Tale" typeface="Microsoft Tai Le"/>
+        <a:font script="Talu" typeface="Microsoft New Tai Lue"/>
+        <a:font script="Tfng" typeface="Ebrima"/>
+      </a:minorFont>
+    </a:fontScheme>
+    <a:fmtScheme name="Office">
+      <a:fillStyleLst>
+        <a:solidFill>
+          <a:schemeClr val="phClr"/>
+        </a:solidFill>
+        <a:gradFill rotWithShape="true">
+          <a:gsLst>
+            <a:gs pos="0">
+              <a:schemeClr val="phClr">
+                <a:lumMod val="110000"/>
+                <a:satMod val="105000"/>
+                <a:tint val="67000"/>
+              </a:schemeClr>
+            </a:gs>
+            <a:gs pos="50000">
+              <a:schemeClr val="phClr">
+                <a:lumMod val="105000"/>
+                <a:satMod val="103000"/>
+                <a:tint val="73000"/>
+              </a:schemeClr>
+            </a:gs>
+            <a:gs pos="100000">
+              <a:schemeClr val="phClr">
+                <a:lumMod val="105000"/>
+                <a:satMod val="109000"/>
+                <a:tint val="81000"/>
+              </a:schemeClr>
+            </a:gs>
+          </a:gsLst>
+          <a:lin ang="5400000" scaled="false"/>
+        </a:gradFill>
+        <a:gradFill rotWithShape="true">
+          <a:gsLst>
+            <a:gs pos="0">
+              <a:schemeClr val="phClr">
+                <a:satMod val="103000"/>
+                <a:lumMod val="102000"/>
+                <a:tint val="94000"/>
+              </a:schemeClr>
+            </a:gs>
+            <a:gs pos="50000">
+              <a:schemeClr val="phClr">
+                <a:satMod val="110000"/>
+                <a:lumMod val="100000"/>
+                <a:shade val="100000"/>
+              </a:schemeClr>
+            </a:gs>
+            <a:gs pos="100000">
+              <a:schemeClr val="phClr">
+                <a:lumMod val="99000"/>
+                <a:satMod val="120000"/>
+                <a:shade val="78000"/>
+              </a:schemeClr>
+            </a:gs>
+          </a:gsLst>
+          <a:lin ang="5400000" scaled="false"/>
+        </a:gradFill>
+      </a:fillStyleLst>
+      <a:lnStyleLst>
+        <a:ln w="6350" cap="flat" cmpd="sng" algn="ctr">
+          <a:solidFill>
+            <a:schemeClr val="phClr"/>
+          </a:solidFill>
+          <a:prstDash val="solid"/>
+          <a:miter lim="800000"/>
+        </a:ln>
+        <a:ln w="12700" cap="flat" cmpd="sng" algn="ctr">
+          <a:solidFill>
+            <a:schemeClr val="phClr"/>
+          </a:solidFill>
+          <a:prstDash val="solid"/>
+          <a:miter lim="800000"/>
+        </a:ln>
+        <a:ln w="19050" cap="flat" cmpd="sng" algn="ctr">
+          <a:solidFill>
+            <a:schemeClr val="phClr"/>
+          </a:solidFill>
+          <a:prstDash val="solid"/>
+          <a:miter lim="800000"/>
+        </a:ln>
+      </a:lnStyleLst>
+      <a:effectStyleLst>
+        <a:effectStyle>
+          <a:effectLst/>
+        </a:effectStyle>
+        <a:effectStyle>
+          <a:effectLst/>
+        </a:effectStyle>
+        <a:effectStyle>
+          <a:effectLst>
+            <a:outerShdw blurRad="57150" dist="19050" dir="5400000" algn="ctr" rotWithShape="false">
+              <a:srgbClr val="000000">
+                <a:alpha val="63000"/>
+              </a:srgbClr>
+            </a:outerShdw>
+          </a:effectLst>
+        </a:effectStyle>
+      </a:effectStyleLst>
+      <a:bgFillStyleLst>
+        <a:solidFill>
+          <a:schemeClr val="phClr"/>
+        </a:solidFill>
+        <a:solidFill>
+          <a:schemeClr val="phClr">
+            <a:tint val="95000"/>
+            <a:satMod val="170000"/>
+          </a:schemeClr>
+        </a:solidFill>
+        <a:gradFill rotWithShape="true">
+          <a:gsLst>
+            <a:gs pos="0">
+              <a:schemeClr val="phClr">
+                <a:tint val="93000"/>
+                <a:satMod val="150000"/>
+                <a:shade val="98000"/>
+                <a:lumMod val="102000"/>
+              </a:schemeClr>
+            </a:gs>
+            <a:gs pos="50000">
+              <a:schemeClr val="phClr">
+                <a:tint val="98000"/>
+                <a:satMod val="130000"/>
+                <a:shade val="90000"/>
+                <a:lumMod val="103000"/>
+              </a:schemeClr>
+            </a:gs>
+            <a:gs pos="100000">
+              <a:schemeClr val="phClr">
+                <a:shade val="63000"/>
+                <a:satMod val="120000"/>
+              </a:schemeClr>
+            </a:gs>
+          </a:gsLst>
+          <a:lin ang="5400000" scaled="false"/>
+        </a:gradFill>
+      </a:bgFillStyleLst>
+    </a:fmtScheme>
+  </a:themeElements>
+  <a:objectDefaults/>
+  <a:extraClrSchemeLst/>
+</a:theme>
 </file>
</xml_diff>